<commit_message>
D-18, Done for printing
</commit_message>
<xml_diff>
--- a/Received/five/5, maths.docx
+++ b/Received/five/5, maths.docx
@@ -230,27 +230,7 @@
           <w:bCs/>
           <w:sz w:val="20"/>
         </w:rPr>
-        <w:t xml:space="preserve">Ratnanagar-7, </w:t>
-      </w:r>
-      <w:proofErr w:type="spellStart"/>
-      <w:r>
-        <w:rPr>
-          <w:rFonts w:ascii="Times New Roman" w:hAnsi="Times New Roman"/>
-          <w:b/>
-          <w:bCs/>
-          <w:sz w:val="20"/>
-        </w:rPr>
-        <w:t>Sauraha</w:t>
-      </w:r>
-      <w:proofErr w:type="spellEnd"/>
-      <w:r>
-        <w:rPr>
-          <w:rFonts w:ascii="Times New Roman" w:hAnsi="Times New Roman"/>
-          <w:b/>
-          <w:bCs/>
-          <w:sz w:val="20"/>
-        </w:rPr>
-        <w:t>, Chitwan</w:t>
+        <w:t>Ratnanagar-7, Sauraha, Chitwan</w:t>
       </w:r>
     </w:p>
     <w:p>
@@ -318,7 +298,7 @@
           <w:sz w:val="24"/>
           <w:szCs w:val="24"/>
         </w:rPr>
-        <w:t>Class:</w:t>
+        <w:t>Class: Five</w:t>
       </w:r>
       <w:r>
         <w:rPr>
@@ -328,7 +308,7 @@
           <w:sz w:val="24"/>
           <w:szCs w:val="24"/>
         </w:rPr>
-        <w:t xml:space="preserve"> Five</w:t>
+        <w:tab/>
       </w:r>
       <w:r>
         <w:rPr>
@@ -339,6 +319,10 @@
           <w:szCs w:val="24"/>
         </w:rPr>
         <w:tab/>
+        <w:t xml:space="preserve">                </w:t>
+      </w:r>
+      <w:r>
+        <w:t xml:space="preserve">  </w:t>
       </w:r>
       <w:r>
         <w:rPr>
@@ -348,11 +332,7 @@
           <w:sz w:val="24"/>
           <w:szCs w:val="24"/>
         </w:rPr>
-        <w:tab/>
-        <w:t xml:space="preserve">                </w:t>
-      </w:r>
-      <w:r>
-        <w:t xml:space="preserve">  </w:t>
+        <w:t>Time: 2 hrs.</w:t>
       </w:r>
       <w:r>
         <w:rPr>
@@ -362,7 +342,7 @@
           <w:sz w:val="24"/>
           <w:szCs w:val="24"/>
         </w:rPr>
-        <w:t xml:space="preserve">Time: </w:t>
+        <w:tab/>
       </w:r>
       <w:r>
         <w:rPr>
@@ -372,67 +352,8 @@
           <w:sz w:val="24"/>
           <w:szCs w:val="24"/>
         </w:rPr>
-        <w:t>2</w:t>
-      </w:r>
-      <w:r>
-        <w:rPr>
-          <w:rFonts w:ascii="Times New Roman" w:hAnsi="Times New Roman"/>
-          <w:b/>
-          <w:bCs/>
-          <w:sz w:val="24"/>
-          <w:szCs w:val="24"/>
-        </w:rPr>
-        <w:t xml:space="preserve"> hrs.</w:t>
-      </w:r>
-      <w:r>
-        <w:rPr>
-          <w:rFonts w:ascii="Times New Roman" w:hAnsi="Times New Roman"/>
-          <w:b/>
-          <w:bCs/>
-          <w:sz w:val="24"/>
-          <w:szCs w:val="24"/>
-        </w:rPr>
         <w:tab/>
-      </w:r>
-      <w:r>
-        <w:rPr>
-          <w:rFonts w:ascii="Times New Roman" w:hAnsi="Times New Roman"/>
-          <w:b/>
-          <w:bCs/>
-          <w:sz w:val="24"/>
-          <w:szCs w:val="24"/>
-        </w:rPr>
-        <w:tab/>
-      </w:r>
-      <w:r>
-        <w:rPr>
-          <w:rFonts w:ascii="Times New Roman" w:hAnsi="Times New Roman"/>
-          <w:b/>
-          <w:bCs/>
-          <w:sz w:val="24"/>
-          <w:szCs w:val="24"/>
-        </w:rPr>
-        <w:t xml:space="preserve">           </w:t>
-      </w:r>
-      <w:r>
-        <w:rPr>
-          <w:rFonts w:ascii="Times New Roman" w:hAnsi="Times New Roman"/>
-          <w:b/>
-          <w:bCs/>
-          <w:sz w:val="24"/>
-          <w:szCs w:val="24"/>
-        </w:rPr>
-        <w:t>F.M.:</w:t>
-      </w:r>
-      <w:r>
-        <w:rPr>
-          <w:rFonts w:ascii="Times New Roman" w:hAnsi="Times New Roman"/>
-          <w:b/>
-          <w:bCs/>
-          <w:sz w:val="24"/>
-          <w:szCs w:val="24"/>
-        </w:rPr>
-        <w:t xml:space="preserve"> 50</w:t>
+        <w:t xml:space="preserve">           F.M.: 50</w:t>
       </w:r>
     </w:p>
     <w:p>
@@ -457,30 +378,8 @@
           <w:sz w:val="24"/>
           <w:szCs w:val="24"/>
         </w:rPr>
-        <w:t>Sub:</w:t>
-      </w:r>
-      <w:r>
-        <w:rPr>
-          <w:rFonts w:ascii="Times New Roman" w:hAnsi="Times New Roman"/>
-          <w:b/>
-          <w:bCs/>
-          <w:sz w:val="24"/>
-          <w:szCs w:val="24"/>
-        </w:rPr>
-        <w:t xml:space="preserve"> </w:t>
-      </w:r>
-      <w:proofErr w:type="spellStart"/>
-      <w:r>
-        <w:rPr>
-          <w:rFonts w:ascii="Times New Roman" w:hAnsi="Times New Roman"/>
-          <w:b/>
-          <w:bCs/>
-          <w:sz w:val="24"/>
-          <w:szCs w:val="24"/>
-        </w:rPr>
-        <w:t>Maths</w:t>
-      </w:r>
-      <w:proofErr w:type="spellEnd"/>
+        <w:t>Sub: Maths</w:t>
+      </w:r>
     </w:p>
     <w:p>
       <w:pPr>
@@ -500,7 +399,7 @@
         <mc:AlternateContent>
           <mc:Choice Requires="wpg">
             <w:drawing>
-              <wp:anchor distT="0" distB="0" distL="114300" distR="114300" simplePos="0" relativeHeight="251707392" behindDoc="0" locked="0" layoutInCell="1" allowOverlap="1" wp14:anchorId="357CAD77" wp14:editId="184FDFC3">
+              <wp:anchor distT="0" distB="0" distL="114300" distR="114300" simplePos="0" relativeHeight="251707392" behindDoc="0" locked="0" layoutInCell="1" allowOverlap="1" wp14:anchorId="357CAD77" wp14:editId="545E27B1">
                 <wp:simplePos x="0" y="0"/>
                 <wp:positionH relativeFrom="column">
                   <wp:posOffset>2962275</wp:posOffset>
@@ -524,6 +423,7 @@
                           <a:chOff x="0" y="0"/>
                           <a:chExt cx="1809750" cy="870585"/>
                         </a:xfrm>
+                        <a:effectLst/>
                       </wpg:grpSpPr>
                       <wps:wsp>
                         <wps:cNvPr id="1270128810" name="Straight Connector 1270128810"/>
@@ -541,6 +441,7 @@
                               <a:schemeClr val="tx1"/>
                             </a:solidFill>
                           </a:ln>
+                          <a:effectLst/>
                         </wps:spPr>
                         <wps:style>
                           <a:lnRef idx="2">
@@ -576,13 +477,7 @@
                             </a:solidFill>
                             <a:prstDash val="solid"/>
                           </a:ln>
-                          <a:effectLst>
-                            <a:outerShdw blurRad="40000" dist="20000" dir="5400000" rotWithShape="0">
-                              <a:srgbClr val="000000">
-                                <a:alpha val="38000"/>
-                              </a:srgbClr>
-                            </a:outerShdw>
-                          </a:effectLst>
+                          <a:effectLst/>
                         </wps:spPr>
                         <wps:bodyPr/>
                       </wps:wsp>
@@ -742,13 +637,9 @@
           </mc:Choice>
           <mc:Fallback>
             <w:pict>
-              <v:group w14:anchorId="357CAD77" id="Group 33" o:spid="_x0000_s1027" style="position:absolute;left:0;text-align:left;margin-left:233.25pt;margin-top:8.65pt;width:142.5pt;height:68.55pt;z-index:251707392" coordsize="18097,8705" o:gfxdata="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">
-                <v:line id="Straight Connector 1270128810" o:spid="_x0000_s1028" style="position:absolute;flip:y;visibility:visible;mso-wrap-style:square" from="2857,7334" to="15125,7334" o:connectortype="straight" o:gfxdata="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" strokecolor="black [3213]" strokeweight="2pt">
-                  <v:shadow on="t" color="black" opacity="24903f" origin=",.5" offset="0,.55556mm"/>
-                </v:line>
-                <v:line id="Straight Connector 2053295217" o:spid="_x0000_s1029" style="position:absolute;flip:y;visibility:visible;mso-wrap-style:square" from="2857,2000" to="12839,7258" o:connectortype="straight" o:gfxdata="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" strokecolor="windowText" strokeweight="2pt">
-                  <v:shadow on="t" color="black" opacity="24903f" origin=",.5" offset="0,.55556mm"/>
-                </v:line>
+              <v:group w14:anchorId="357CAD77" id="Group 33" o:spid="_x0000_s1027" style="position:absolute;left:0;text-align:left;margin-left:233.25pt;margin-top:8.65pt;width:142.5pt;height:68.55pt;z-index:251707392" coordsize="18097,8705" o:gfxdata="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">
+                <v:line id="Straight Connector 1270128810" o:spid="_x0000_s1028" style="position:absolute;flip:y;visibility:visible;mso-wrap-style:square" from="2857,7334" to="15125,7334" o:connectortype="straight" o:gfxdata="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" strokecolor="black [3213]" strokeweight="2pt"/>
+                <v:line id="Straight Connector 2053295217" o:spid="_x0000_s1029" style="position:absolute;flip:y;visibility:visible;mso-wrap-style:square" from="2857,2000" to="12839,7258" o:connectortype="straight" o:gfxdata="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" strokecolor="windowText" strokeweight="2pt"/>
                 <v:shapetype id="_x0000_t38" coordsize="21600,21600" o:spt="38" o:oned="t" path="m,c@0,0@1,5400@1,10800@1,16200@2,21600,21600,21600e" filled="f">
                   <v:formulas>
                     <v:f eqn="mid #0 0"/>
@@ -882,9 +773,481 @@
           <w:noProof/>
         </w:rPr>
         <mc:AlternateContent>
+          <mc:Choice Requires="wps">
+            <w:drawing>
+              <wp:anchor distT="45720" distB="45720" distL="114300" distR="114300" simplePos="0" relativeHeight="251780096" behindDoc="0" locked="0" layoutInCell="1" allowOverlap="1" wp14:anchorId="7148D378" wp14:editId="3ACEE21B">
+                <wp:simplePos x="0" y="0"/>
+                <wp:positionH relativeFrom="column">
+                  <wp:posOffset>4166843</wp:posOffset>
+                </wp:positionH>
+                <wp:positionV relativeFrom="paragraph">
+                  <wp:posOffset>871508</wp:posOffset>
+                </wp:positionV>
+                <wp:extent cx="341412" cy="252095"/>
+                <wp:effectExtent l="0" t="0" r="0" b="0"/>
+                <wp:wrapNone/>
+                <wp:docPr id="1033840285" name="Text Box 2"/>
+                <wp:cNvGraphicFramePr>
+                  <a:graphicFrameLocks xmlns:a="http://schemas.openxmlformats.org/drawingml/2006/main"/>
+                </wp:cNvGraphicFramePr>
+                <a:graphic xmlns:a="http://schemas.openxmlformats.org/drawingml/2006/main">
+                  <a:graphicData uri="http://schemas.microsoft.com/office/word/2010/wordprocessingShape">
+                    <wps:wsp>
+                      <wps:cNvSpPr txBox="1">
+                        <a:spLocks noChangeArrowheads="1"/>
+                      </wps:cNvSpPr>
+                      <wps:spPr bwMode="auto">
+                        <a:xfrm>
+                          <a:off x="0" y="0"/>
+                          <a:ext cx="341412" cy="252095"/>
+                        </a:xfrm>
+                        <a:prstGeom prst="rect">
+                          <a:avLst/>
+                        </a:prstGeom>
+                        <a:noFill/>
+                        <a:ln w="9525">
+                          <a:noFill/>
+                          <a:miter lim="800000"/>
+                          <a:headEnd/>
+                          <a:tailEnd/>
+                        </a:ln>
+                      </wps:spPr>
+                      <wps:txbx>
+                        <w:txbxContent>
+                          <w:p>
+                            <w:pPr>
+                              <w:rPr>
+                                <w:sz w:val="16"/>
+                                <w:szCs w:val="16"/>
+                              </w:rPr>
+                            </w:pPr>
+                            <w:r>
+                              <w:rPr>
+                                <w:sz w:val="16"/>
+                                <w:szCs w:val="16"/>
+                              </w:rPr>
+                              <w:t>70</w:t>
+                            </w:r>
+                            <w:r>
+                              <w:rPr>
+                                <w:sz w:val="16"/>
+                                <w:szCs w:val="16"/>
+                                <w:vertAlign w:val="superscript"/>
+                              </w:rPr>
+                              <w:t>0</w:t>
+                            </w:r>
+                          </w:p>
+                        </w:txbxContent>
+                      </wps:txbx>
+                      <wps:bodyPr rot="0" vert="horz" wrap="square" lIns="91440" tIns="45720" rIns="91440" bIns="45720" anchor="t" anchorCtr="0">
+                        <a:noAutofit/>
+                      </wps:bodyPr>
+                    </wps:wsp>
+                  </a:graphicData>
+                </a:graphic>
+                <wp14:sizeRelH relativeFrom="margin">
+                  <wp14:pctWidth>0</wp14:pctWidth>
+                </wp14:sizeRelH>
+                <wp14:sizeRelV relativeFrom="margin">
+                  <wp14:pctHeight>0</wp14:pctHeight>
+                </wp14:sizeRelV>
+              </wp:anchor>
+            </w:drawing>
+          </mc:Choice>
+          <mc:Fallback>
+            <w:pict>
+              <v:shape w14:anchorId="7148D378" id="Text Box 2" o:spid="_x0000_s1034" type="#_x0000_t202" style="position:absolute;left:0;text-align:left;margin-left:328.1pt;margin-top:68.6pt;width:26.9pt;height:19.85pt;z-index:251780096;visibility:visible;mso-wrap-style:square;mso-width-percent:0;mso-height-percent:0;mso-wrap-distance-left:9pt;mso-wrap-distance-top:3.6pt;mso-wrap-distance-right:9pt;mso-wrap-distance-bottom:3.6pt;mso-position-horizontal:absolute;mso-position-horizontal-relative:text;mso-position-vertical:absolute;mso-position-vertical-relative:text;mso-width-percent:0;mso-height-percent:0;mso-width-relative:margin;mso-height-relative:margin;v-text-anchor:top" o:gfxdata="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" filled="f" stroked="f">
+                <v:textbox>
+                  <w:txbxContent>
+                    <w:p>
+                      <w:pPr>
+                        <w:rPr>
+                          <w:sz w:val="16"/>
+                          <w:szCs w:val="16"/>
+                        </w:rPr>
+                      </w:pPr>
+                      <w:r>
+                        <w:rPr>
+                          <w:sz w:val="16"/>
+                          <w:szCs w:val="16"/>
+                        </w:rPr>
+                        <w:t>70</w:t>
+                      </w:r>
+                      <w:r>
+                        <w:rPr>
+                          <w:sz w:val="16"/>
+                          <w:szCs w:val="16"/>
+                          <w:vertAlign w:val="superscript"/>
+                        </w:rPr>
+                        <w:t>0</w:t>
+                      </w:r>
+                    </w:p>
+                  </w:txbxContent>
+                </v:textbox>
+              </v:shape>
+            </w:pict>
+          </mc:Fallback>
+        </mc:AlternateContent>
+      </w:r>
+      <w:r>
+        <w:rPr>
+          <w:rFonts w:ascii="Times New Roman" w:hAnsi="Times New Roman" w:cs="Times New Roman"/>
+          <w:noProof/>
+        </w:rPr>
+        <mc:AlternateContent>
+          <mc:Choice Requires="wps">
+            <w:drawing>
+              <wp:anchor distT="45720" distB="45720" distL="114300" distR="114300" simplePos="0" relativeHeight="251778048" behindDoc="0" locked="0" layoutInCell="1" allowOverlap="1" wp14:anchorId="792C7492" wp14:editId="3CFA28B9">
+                <wp:simplePos x="0" y="0"/>
+                <wp:positionH relativeFrom="column">
+                  <wp:posOffset>3858119</wp:posOffset>
+                </wp:positionH>
+                <wp:positionV relativeFrom="paragraph">
+                  <wp:posOffset>877290</wp:posOffset>
+                </wp:positionV>
+                <wp:extent cx="207563" cy="252095"/>
+                <wp:effectExtent l="0" t="0" r="0" b="0"/>
+                <wp:wrapNone/>
+                <wp:docPr id="838902159" name="Text Box 2"/>
+                <wp:cNvGraphicFramePr>
+                  <a:graphicFrameLocks xmlns:a="http://schemas.openxmlformats.org/drawingml/2006/main"/>
+                </wp:cNvGraphicFramePr>
+                <a:graphic xmlns:a="http://schemas.openxmlformats.org/drawingml/2006/main">
+                  <a:graphicData uri="http://schemas.microsoft.com/office/word/2010/wordprocessingShape">
+                    <wps:wsp>
+                      <wps:cNvSpPr txBox="1">
+                        <a:spLocks noChangeArrowheads="1"/>
+                      </wps:cNvSpPr>
+                      <wps:spPr bwMode="auto">
+                        <a:xfrm>
+                          <a:off x="0" y="0"/>
+                          <a:ext cx="207563" cy="252095"/>
+                        </a:xfrm>
+                        <a:prstGeom prst="rect">
+                          <a:avLst/>
+                        </a:prstGeom>
+                        <a:noFill/>
+                        <a:ln w="9525">
+                          <a:noFill/>
+                          <a:miter lim="800000"/>
+                          <a:headEnd/>
+                          <a:tailEnd/>
+                        </a:ln>
+                      </wps:spPr>
+                      <wps:txbx>
+                        <w:txbxContent>
+                          <w:p>
+                            <w:pPr>
+                              <w:rPr>
+                                <w:sz w:val="14"/>
+                                <w:szCs w:val="14"/>
+                              </w:rPr>
+                            </w:pPr>
+                            <w:r>
+                              <w:rPr>
+                                <w:sz w:val="14"/>
+                                <w:szCs w:val="14"/>
+                              </w:rPr>
+                              <w:t>Z</w:t>
+                            </w:r>
+                          </w:p>
+                        </w:txbxContent>
+                      </wps:txbx>
+                      <wps:bodyPr rot="0" vert="horz" wrap="square" lIns="91440" tIns="45720" rIns="91440" bIns="45720" anchor="t" anchorCtr="0">
+                        <a:noAutofit/>
+                      </wps:bodyPr>
+                    </wps:wsp>
+                  </a:graphicData>
+                </a:graphic>
+                <wp14:sizeRelH relativeFrom="margin">
+                  <wp14:pctWidth>0</wp14:pctWidth>
+                </wp14:sizeRelH>
+                <wp14:sizeRelV relativeFrom="margin">
+                  <wp14:pctHeight>0</wp14:pctHeight>
+                </wp14:sizeRelV>
+              </wp:anchor>
+            </w:drawing>
+          </mc:Choice>
+          <mc:Fallback>
+            <w:pict>
+              <v:shape w14:anchorId="792C7492" id="_x0000_s1035" type="#_x0000_t202" style="position:absolute;left:0;text-align:left;margin-left:303.8pt;margin-top:69.1pt;width:16.35pt;height:19.85pt;z-index:251778048;visibility:visible;mso-wrap-style:square;mso-width-percent:0;mso-height-percent:0;mso-wrap-distance-left:9pt;mso-wrap-distance-top:3.6pt;mso-wrap-distance-right:9pt;mso-wrap-distance-bottom:3.6pt;mso-position-horizontal:absolute;mso-position-horizontal-relative:text;mso-position-vertical:absolute;mso-position-vertical-relative:text;mso-width-percent:0;mso-height-percent:0;mso-width-relative:margin;mso-height-relative:margin;v-text-anchor:top" o:gfxdata="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" filled="f" stroked="f">
+                <v:textbox>
+                  <w:txbxContent>
+                    <w:p>
+                      <w:pPr>
+                        <w:rPr>
+                          <w:sz w:val="14"/>
+                          <w:szCs w:val="14"/>
+                        </w:rPr>
+                      </w:pPr>
+                      <w:r>
+                        <w:rPr>
+                          <w:sz w:val="14"/>
+                          <w:szCs w:val="14"/>
+                        </w:rPr>
+                        <w:t>Z</w:t>
+                      </w:r>
+                    </w:p>
+                  </w:txbxContent>
+                </v:textbox>
+              </v:shape>
+            </w:pict>
+          </mc:Fallback>
+        </mc:AlternateContent>
+      </w:r>
+      <w:r>
+        <w:rPr>
+          <w:rFonts w:ascii="Times New Roman" w:hAnsi="Times New Roman" w:cs="Times New Roman"/>
+          <w:noProof/>
+        </w:rPr>
+        <mc:AlternateContent>
+          <mc:Choice Requires="wps">
+            <w:drawing>
+              <wp:anchor distT="45720" distB="45720" distL="114300" distR="114300" simplePos="0" relativeHeight="251776000" behindDoc="0" locked="0" layoutInCell="1" allowOverlap="1" wp14:anchorId="61775C27" wp14:editId="794FE9E8">
+                <wp:simplePos x="0" y="0"/>
+                <wp:positionH relativeFrom="column">
+                  <wp:posOffset>3879188</wp:posOffset>
+                </wp:positionH>
+                <wp:positionV relativeFrom="paragraph">
+                  <wp:posOffset>524187</wp:posOffset>
+                </wp:positionV>
+                <wp:extent cx="369461" cy="252095"/>
+                <wp:effectExtent l="0" t="0" r="0" b="0"/>
+                <wp:wrapNone/>
+                <wp:docPr id="1496174005" name="Text Box 2"/>
+                <wp:cNvGraphicFramePr>
+                  <a:graphicFrameLocks xmlns:a="http://schemas.openxmlformats.org/drawingml/2006/main"/>
+                </wp:cNvGraphicFramePr>
+                <a:graphic xmlns:a="http://schemas.openxmlformats.org/drawingml/2006/main">
+                  <a:graphicData uri="http://schemas.microsoft.com/office/word/2010/wordprocessingShape">
+                    <wps:wsp>
+                      <wps:cNvSpPr txBox="1">
+                        <a:spLocks noChangeArrowheads="1"/>
+                      </wps:cNvSpPr>
+                      <wps:spPr bwMode="auto">
+                        <a:xfrm>
+                          <a:off x="0" y="0"/>
+                          <a:ext cx="369461" cy="252095"/>
+                        </a:xfrm>
+                        <a:prstGeom prst="rect">
+                          <a:avLst/>
+                        </a:prstGeom>
+                        <a:noFill/>
+                        <a:ln w="9525">
+                          <a:noFill/>
+                          <a:miter lim="800000"/>
+                          <a:headEnd/>
+                          <a:tailEnd/>
+                        </a:ln>
+                      </wps:spPr>
+                      <wps:txbx>
+                        <w:txbxContent>
+                          <w:p>
+                            <w:pPr>
+                              <w:rPr>
+                                <w:sz w:val="16"/>
+                                <w:szCs w:val="16"/>
+                              </w:rPr>
+                            </w:pPr>
+                            <w:r>
+                              <w:rPr>
+                                <w:sz w:val="16"/>
+                                <w:szCs w:val="16"/>
+                              </w:rPr>
+                              <w:t>80</w:t>
+                            </w:r>
+                            <w:r>
+                              <w:rPr>
+                                <w:sz w:val="16"/>
+                                <w:szCs w:val="16"/>
+                                <w:vertAlign w:val="superscript"/>
+                              </w:rPr>
+                              <w:t>0</w:t>
+                            </w:r>
+                          </w:p>
+                        </w:txbxContent>
+                      </wps:txbx>
+                      <wps:bodyPr rot="0" vert="horz" wrap="square" lIns="91440" tIns="45720" rIns="91440" bIns="45720" anchor="t" anchorCtr="0">
+                        <a:noAutofit/>
+                      </wps:bodyPr>
+                    </wps:wsp>
+                  </a:graphicData>
+                </a:graphic>
+                <wp14:sizeRelH relativeFrom="margin">
+                  <wp14:pctWidth>0</wp14:pctWidth>
+                </wp14:sizeRelH>
+                <wp14:sizeRelV relativeFrom="margin">
+                  <wp14:pctHeight>0</wp14:pctHeight>
+                </wp14:sizeRelV>
+              </wp:anchor>
+            </w:drawing>
+          </mc:Choice>
+          <mc:Fallback>
+            <w:pict>
+              <v:shape w14:anchorId="61775C27" id="_x0000_s1036" type="#_x0000_t202" style="position:absolute;left:0;text-align:left;margin-left:305.45pt;margin-top:41.25pt;width:29.1pt;height:19.85pt;z-index:251776000;visibility:visible;mso-wrap-style:square;mso-width-percent:0;mso-height-percent:0;mso-wrap-distance-left:9pt;mso-wrap-distance-top:3.6pt;mso-wrap-distance-right:9pt;mso-wrap-distance-bottom:3.6pt;mso-position-horizontal:absolute;mso-position-horizontal-relative:text;mso-position-vertical:absolute;mso-position-vertical-relative:text;mso-width-percent:0;mso-height-percent:0;mso-width-relative:margin;mso-height-relative:margin;v-text-anchor:top" o:gfxdata="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" filled="f" stroked="f">
+                <v:textbox>
+                  <w:txbxContent>
+                    <w:p>
+                      <w:pPr>
+                        <w:rPr>
+                          <w:sz w:val="16"/>
+                          <w:szCs w:val="16"/>
+                        </w:rPr>
+                      </w:pPr>
+                      <w:r>
+                        <w:rPr>
+                          <w:sz w:val="16"/>
+                          <w:szCs w:val="16"/>
+                        </w:rPr>
+                        <w:t>80</w:t>
+                      </w:r>
+                      <w:r>
+                        <w:rPr>
+                          <w:sz w:val="16"/>
+                          <w:szCs w:val="16"/>
+                          <w:vertAlign w:val="superscript"/>
+                        </w:rPr>
+                        <w:t>0</w:t>
+                      </w:r>
+                    </w:p>
+                  </w:txbxContent>
+                </v:textbox>
+              </v:shape>
+            </w:pict>
+          </mc:Fallback>
+        </mc:AlternateContent>
+      </w:r>
+      <w:r>
+        <w:rPr>
+          <w:rFonts w:ascii="Times New Roman" w:hAnsi="Times New Roman" w:cs="Times New Roman"/>
+          <w:noProof/>
+        </w:rPr>
+        <mc:AlternateContent>
+          <mc:Choice Requires="wps">
+            <w:drawing>
+              <wp:anchor distT="45720" distB="45720" distL="114300" distR="114300" simplePos="0" relativeHeight="251782144" behindDoc="0" locked="0" layoutInCell="1" allowOverlap="1" wp14:anchorId="4EE88EF5" wp14:editId="3142639B">
+                <wp:simplePos x="0" y="0"/>
+                <wp:positionH relativeFrom="column">
+                  <wp:posOffset>4058258</wp:posOffset>
+                </wp:positionH>
+                <wp:positionV relativeFrom="paragraph">
+                  <wp:posOffset>636383</wp:posOffset>
+                </wp:positionV>
+                <wp:extent cx="421336" cy="252442"/>
+                <wp:effectExtent l="0" t="0" r="0" b="0"/>
+                <wp:wrapNone/>
+                <wp:docPr id="1863886206" name="Text Box 2"/>
+                <wp:cNvGraphicFramePr>
+                  <a:graphicFrameLocks xmlns:a="http://schemas.openxmlformats.org/drawingml/2006/main"/>
+                </wp:cNvGraphicFramePr>
+                <a:graphic xmlns:a="http://schemas.openxmlformats.org/drawingml/2006/main">
+                  <a:graphicData uri="http://schemas.microsoft.com/office/word/2010/wordprocessingShape">
+                    <wps:wsp>
+                      <wps:cNvSpPr txBox="1">
+                        <a:spLocks noChangeArrowheads="1"/>
+                      </wps:cNvSpPr>
+                      <wps:spPr bwMode="auto">
+                        <a:xfrm>
+                          <a:off x="0" y="0"/>
+                          <a:ext cx="421336" cy="252442"/>
+                        </a:xfrm>
+                        <a:prstGeom prst="rect">
+                          <a:avLst/>
+                        </a:prstGeom>
+                        <a:noFill/>
+                        <a:ln w="9525">
+                          <a:noFill/>
+                          <a:miter lim="800000"/>
+                          <a:headEnd/>
+                          <a:tailEnd/>
+                        </a:ln>
+                      </wps:spPr>
+                      <wps:txbx>
+                        <w:txbxContent>
+                          <w:p>
+                            <w:pPr>
+                              <w:rPr>
+                                <w:sz w:val="16"/>
+                                <w:szCs w:val="16"/>
+                              </w:rPr>
+                            </w:pPr>
+                            <w:r>
+                              <w:rPr>
+                                <w:sz w:val="16"/>
+                                <w:szCs w:val="16"/>
+                              </w:rPr>
+                              <w:t>120</w:t>
+                            </w:r>
+                            <w:r>
+                              <w:rPr>
+                                <w:sz w:val="16"/>
+                                <w:szCs w:val="16"/>
+                                <w:vertAlign w:val="superscript"/>
+                              </w:rPr>
+                              <w:t>0</w:t>
+                            </w:r>
+                          </w:p>
+                        </w:txbxContent>
+                      </wps:txbx>
+                      <wps:bodyPr rot="0" vert="horz" wrap="square" lIns="91440" tIns="45720" rIns="91440" bIns="45720" anchor="t" anchorCtr="0">
+                        <a:noAutofit/>
+                      </wps:bodyPr>
+                    </wps:wsp>
+                  </a:graphicData>
+                </a:graphic>
+                <wp14:sizeRelH relativeFrom="margin">
+                  <wp14:pctWidth>0</wp14:pctWidth>
+                </wp14:sizeRelH>
+                <wp14:sizeRelV relativeFrom="margin">
+                  <wp14:pctHeight>0</wp14:pctHeight>
+                </wp14:sizeRelV>
+              </wp:anchor>
+            </w:drawing>
+          </mc:Choice>
+          <mc:Fallback>
+            <w:pict>
+              <v:shape w14:anchorId="4EE88EF5" id="_x0000_s1037" type="#_x0000_t202" style="position:absolute;left:0;text-align:left;margin-left:319.55pt;margin-top:50.1pt;width:33.2pt;height:19.9pt;z-index:251782144;visibility:visible;mso-wrap-style:square;mso-width-percent:0;mso-height-percent:0;mso-wrap-distance-left:9pt;mso-wrap-distance-top:3.6pt;mso-wrap-distance-right:9pt;mso-wrap-distance-bottom:3.6pt;mso-position-horizontal:absolute;mso-position-horizontal-relative:text;mso-position-vertical:absolute;mso-position-vertical-relative:text;mso-width-percent:0;mso-height-percent:0;mso-width-relative:margin;mso-height-relative:margin;v-text-anchor:top" o:gfxdata="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" filled="f" stroked="f">
+                <v:textbox>
+                  <w:txbxContent>
+                    <w:p>
+                      <w:pPr>
+                        <w:rPr>
+                          <w:sz w:val="16"/>
+                          <w:szCs w:val="16"/>
+                        </w:rPr>
+                      </w:pPr>
+                      <w:r>
+                        <w:rPr>
+                          <w:sz w:val="16"/>
+                          <w:szCs w:val="16"/>
+                        </w:rPr>
+                        <w:t>120</w:t>
+                      </w:r>
+                      <w:r>
+                        <w:rPr>
+                          <w:sz w:val="16"/>
+                          <w:szCs w:val="16"/>
+                          <w:vertAlign w:val="superscript"/>
+                        </w:rPr>
+                        <w:t>0</w:t>
+                      </w:r>
+                    </w:p>
+                  </w:txbxContent>
+                </v:textbox>
+              </v:shape>
+            </w:pict>
+          </mc:Fallback>
+        </mc:AlternateContent>
+      </w:r>
+      <w:r>
+        <w:rPr>
+          <w:rFonts w:ascii="Times New Roman" w:hAnsi="Times New Roman" w:cs="Times New Roman"/>
+          <w:noProof/>
+        </w:rPr>
+        <mc:AlternateContent>
           <mc:Choice Requires="wpg">
             <w:drawing>
-              <wp:anchor distT="0" distB="0" distL="114300" distR="114300" simplePos="0" relativeHeight="251738112" behindDoc="0" locked="0" layoutInCell="1" allowOverlap="1" wp14:anchorId="6D0F1CBC" wp14:editId="2750E517">
+              <wp:anchor distT="0" distB="0" distL="114300" distR="114300" simplePos="0" relativeHeight="251738112" behindDoc="0" locked="0" layoutInCell="1" allowOverlap="1" wp14:anchorId="6D0F1CBC" wp14:editId="1530D157">
                 <wp:simplePos x="0" y="0"/>
                 <wp:positionH relativeFrom="column">
                   <wp:posOffset>3552825</wp:posOffset>
@@ -908,6 +1271,7 @@
                           <a:chOff x="0" y="0"/>
                           <a:chExt cx="1280160" cy="998220"/>
                         </a:xfrm>
+                        <a:effectLst/>
                       </wpg:grpSpPr>
                       <wps:wsp>
                         <wps:cNvPr id="379804037" name="Straight Connector 379804037"/>
@@ -1305,32 +1669,32 @@
           </mc:Choice>
           <mc:Fallback>
             <w:pict>
-              <v:group w14:anchorId="6D0F1CBC" id="Group 32" o:spid="_x0000_s1034" style="position:absolute;left:0;text-align:left;margin-left:279.75pt;margin-top:19pt;width:100.8pt;height:78.6pt;z-index:251738112" coordsize="12801,9982" o:gfxdata="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">
-                <v:line id="Straight Connector 379804037" o:spid="_x0000_s1035" style="position:absolute;visibility:visible;mso-wrap-style:square" from="3143,1714" to="3219,9029" o:connectortype="straight" o:gfxdata="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" strokecolor="black [3213]" strokeweight="2pt">
+              <v:group w14:anchorId="6D0F1CBC" id="Group 32" o:spid="_x0000_s1038" style="position:absolute;left:0;text-align:left;margin-left:279.75pt;margin-top:19pt;width:100.8pt;height:78.6pt;z-index:251738112" coordsize="12801,9982" o:gfxdata="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">
+                <v:line id="Straight Connector 379804037" o:spid="_x0000_s1039" style="position:absolute;visibility:visible;mso-wrap-style:square" from="3143,1714" to="3219,9029" o:connectortype="straight" o:gfxdata="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" strokecolor="black [3213]" strokeweight="2pt">
                   <v:shadow on="t" color="black" opacity="24903f" origin=",.5" offset="0,.55556mm"/>
                 </v:line>
-                <v:line id="Straight Connector 591536350" o:spid="_x0000_s1036" style="position:absolute;visibility:visible;mso-wrap-style:square" from="9620,3619" to="9696,9105" o:connectortype="straight" o:gfxdata="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" strokecolor="black [3213]" strokeweight="2pt">
+                <v:line id="Straight Connector 591536350" o:spid="_x0000_s1040" style="position:absolute;visibility:visible;mso-wrap-style:square" from="9620,3619" to="9696,9105" o:connectortype="straight" o:gfxdata="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" strokecolor="black [3213]" strokeweight="2pt">
                   <v:shadow on="t" color="black" opacity="24903f" origin=",.5" offset="0,.55556mm"/>
                 </v:line>
-                <v:line id="Straight Connector 811220546" o:spid="_x0000_s1037" style="position:absolute;visibility:visible;mso-wrap-style:square" from="3048,8858" to="9982,9086" o:connectortype="straight" o:gfxdata="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" strokecolor="black [3213]" strokeweight="2pt">
+                <v:line id="Straight Connector 811220546" o:spid="_x0000_s1041" style="position:absolute;visibility:visible;mso-wrap-style:square" from="3048,8858" to="9982,9086" o:connectortype="straight" o:gfxdata="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" strokecolor="black [3213]" strokeweight="2pt">
                   <v:shadow on="t" color="black" opacity="24903f" origin=",.5" offset="0,.55556mm"/>
                 </v:line>
-                <v:line id="Straight Connector 617894949" o:spid="_x0000_s1038" style="position:absolute;visibility:visible;mso-wrap-style:square" from="3048,1524" to="10134,3962" o:connectortype="straight" o:gfxdata="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" strokecolor="black [3213]" strokeweight="2pt">
+                <v:line id="Straight Connector 617894949" o:spid="_x0000_s1042" style="position:absolute;visibility:visible;mso-wrap-style:square" from="3048,1524" to="10134,3962" o:connectortype="straight" o:gfxdata="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" strokecolor="black [3213]" strokeweight="2pt">
                   <v:shadow on="t" color="black" opacity="24903f" origin=",.5" offset="0,.55556mm"/>
                 </v:line>
-                <v:shape id="Curved Connector 15" o:spid="_x0000_s1039" type="#_x0000_t38" style="position:absolute;left:2952;top:7810;width:451;height:1143;visibility:visible;mso-wrap-style:square" o:connectortype="curved" o:gfxdata="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" adj="67680" strokecolor="windowText" strokeweight="2pt">
+                <v:shape id="Curved Connector 15" o:spid="_x0000_s1043" type="#_x0000_t38" style="position:absolute;left:2952;top:7810;width:451;height:1143;visibility:visible;mso-wrap-style:square" o:connectortype="curved" o:gfxdata="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" adj="67680" strokecolor="windowText" strokeweight="2pt">
                   <v:shadow on="t" color="black" opacity="24903f" origin=",.5" offset="0,.55556mm"/>
                 </v:shape>
-                <v:shape id="Curved Connector 16" o:spid="_x0000_s1040" type="#_x0000_t38" style="position:absolute;left:3238;top:1809;width:838;height:1905;flip:x;visibility:visible;mso-wrap-style:square" o:connectortype="curved" o:gfxdata="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" adj="-18793" strokecolor="windowText" strokeweight="2pt">
+                <v:shape id="Curved Connector 16" o:spid="_x0000_s1044" type="#_x0000_t38" style="position:absolute;left:3238;top:1809;width:838;height:1905;flip:x;visibility:visible;mso-wrap-style:square" o:connectortype="curved" o:gfxdata="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" adj="-18793" strokecolor="windowText" strokeweight="2pt">
                   <v:shadow on="t" color="black" opacity="24903f" origin=",.5" offset="0,.55556mm"/>
                 </v:shape>
-                <v:shape id="Curved Connector 17" o:spid="_x0000_s1041" type="#_x0000_t38" style="position:absolute;left:8953;top:7429;width:686;height:1600;flip:x;visibility:visible;mso-wrap-style:square" o:connectortype="curved" o:gfxdata="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" adj="35207" strokecolor="windowText" strokeweight="2pt">
+                <v:shape id="Curved Connector 17" o:spid="_x0000_s1045" type="#_x0000_t38" style="position:absolute;left:8953;top:7429;width:686;height:1600;flip:x;visibility:visible;mso-wrap-style:square" o:connectortype="curved" o:gfxdata="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" adj="35207" strokecolor="windowText" strokeweight="2pt">
                   <v:shadow on="t" color="black" opacity="24903f" origin=",.5" offset="0,.55556mm"/>
                 </v:shape>
-                <v:shape id="Curved Connector 18" o:spid="_x0000_s1042" type="#_x0000_t38" style="position:absolute;left:8763;top:3333;width:1066;height:1600;visibility:visible;mso-wrap-style:square" o:connectortype="curved" o:gfxdata="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" adj="-17291" strokecolor="windowText" strokeweight="2pt">
+                <v:shape id="Curved Connector 18" o:spid="_x0000_s1046" type="#_x0000_t38" style="position:absolute;left:8763;top:3333;width:1066;height:1600;visibility:visible;mso-wrap-style:square" o:connectortype="curved" o:gfxdata="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" adj="-17291" strokecolor="windowText" strokeweight="2pt">
                   <v:shadow on="t" color="black" opacity="24903f" origin=",.5" offset="0,.55556mm"/>
                 </v:shape>
-                <v:shape id="Text Box 1758728318" o:spid="_x0000_s1043" type="#_x0000_t202" style="position:absolute;width:2362;height:2133;visibility:visible;mso-wrap-style:square;v-text-anchor:top" o:gfxdata="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" fillcolor="white [3201]" stroked="f" strokeweight=".5pt">
+                <v:shape id="Text Box 1758728318" o:spid="_x0000_s1047" type="#_x0000_t202" style="position:absolute;width:2362;height:2133;visibility:visible;mso-wrap-style:square;v-text-anchor:top" o:gfxdata="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" fillcolor="white [3201]" stroked="f" strokeweight=".5pt">
                   <v:textbox>
                     <w:txbxContent>
                       <w:p>
@@ -1341,7 +1705,7 @@
                     </w:txbxContent>
                   </v:textbox>
                 </v:shape>
-                <v:shape id="Text Box 1673643463" o:spid="_x0000_s1044" type="#_x0000_t202" style="position:absolute;left:285;top:7620;width:2210;height:2362;visibility:visible;mso-wrap-style:square;v-text-anchor:top" o:gfxdata="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" fillcolor="window" stroked="f" strokeweight=".5pt">
+                <v:shape id="Text Box 1673643463" o:spid="_x0000_s1048" type="#_x0000_t202" style="position:absolute;left:285;top:7620;width:2210;height:2362;visibility:visible;mso-wrap-style:square;v-text-anchor:top" o:gfxdata="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" fillcolor="window" stroked="f" strokeweight=".5pt">
                   <v:textbox>
                     <w:txbxContent>
                       <w:p>
@@ -1352,7 +1716,7 @@
                     </w:txbxContent>
                   </v:textbox>
                 </v:shape>
-                <v:shape id="Text Box 1185803973" o:spid="_x0000_s1045" type="#_x0000_t202" style="position:absolute;left:10287;top:7524;width:2514;height:2362;visibility:visible;mso-wrap-style:square;v-text-anchor:top" o:gfxdata="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" fillcolor="window" stroked="f" strokeweight=".5pt">
+                <v:shape id="Text Box 1185803973" o:spid="_x0000_s1049" type="#_x0000_t202" style="position:absolute;left:10287;top:7524;width:2514;height:2362;visibility:visible;mso-wrap-style:square;v-text-anchor:top" o:gfxdata="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" fillcolor="window" stroked="f" strokeweight=".5pt">
                   <v:textbox>
                     <w:txbxContent>
                       <w:p>
@@ -1363,7 +1727,7 @@
                     </w:txbxContent>
                   </v:textbox>
                 </v:shape>
-                <v:shape id="Text Box 1737536518" o:spid="_x0000_s1046" type="#_x0000_t202" style="position:absolute;left:10096;top:2286;width:2438;height:2438;visibility:visible;mso-wrap-style:square;v-text-anchor:top" o:gfxdata="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" fillcolor="window" stroked="f" strokeweight=".5pt">
+                <v:shape id="Text Box 1737536518" o:spid="_x0000_s1050" type="#_x0000_t202" style="position:absolute;left:10096;top:2286;width:2438;height:2438;visibility:visible;mso-wrap-style:square;v-text-anchor:top" o:gfxdata="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" fillcolor="window" stroked="f" strokeweight=".5pt">
                   <v:textbox>
                     <w:txbxContent>
                       <w:p>
@@ -2329,6 +2693,13 @@
           <w:rFonts w:ascii="Times New Roman" w:hAnsi="Times New Roman" w:cs="Times New Roman"/>
         </w:rPr>
         <w:br/>
+      </w:r>
+      <w:r>
+        <w:rPr>
+          <w:rFonts w:ascii="Times New Roman" w:hAnsi="Times New Roman" w:cs="Times New Roman"/>
+          <w:b/>
+          <w:bCs/>
+        </w:rPr>
         <w:t>7.</w:t>
       </w:r>
       <w:r>
@@ -2349,7 +2720,6 @@
         </w:rPr>
         <w:t xml:space="preserve">(a) How many </w:t>
       </w:r>
-      <w:proofErr w:type="spellStart"/>
       <w:proofErr w:type="gramStart"/>
       <w:r>
         <w:rPr>
@@ -2357,7 +2727,6 @@
         </w:rPr>
         <w:t>Litre</w:t>
       </w:r>
-      <w:proofErr w:type="spellEnd"/>
       <w:proofErr w:type="gramEnd"/>
       <w:r>
         <w:rPr>
@@ -2649,7 +3018,49 @@
           <w:rFonts w:ascii="Times New Roman" w:hAnsi="Times New Roman" w:cs="Times New Roman"/>
         </w:rPr>
         <w:br/>
-        <w:t>(b) Find the perimeter. [1]</w:t>
+        <w:t>(b) Find the perimeter.</w:t>
+      </w:r>
+      <w:r>
+        <w:rPr>
+          <w:rFonts w:ascii="Times New Roman" w:hAnsi="Times New Roman" w:cs="Times New Roman"/>
+        </w:rPr>
+        <w:tab/>
+      </w:r>
+      <w:r>
+        <w:rPr>
+          <w:rFonts w:ascii="Times New Roman" w:hAnsi="Times New Roman" w:cs="Times New Roman"/>
+        </w:rPr>
+        <w:tab/>
+      </w:r>
+      <w:r>
+        <w:rPr>
+          <w:rFonts w:ascii="Times New Roman" w:hAnsi="Times New Roman" w:cs="Times New Roman"/>
+        </w:rPr>
+        <w:tab/>
+      </w:r>
+      <w:r>
+        <w:rPr>
+          <w:rFonts w:ascii="Times New Roman" w:hAnsi="Times New Roman" w:cs="Times New Roman"/>
+        </w:rPr>
+        <w:tab/>
+      </w:r>
+      <w:r>
+        <w:rPr>
+          <w:rFonts w:ascii="Times New Roman" w:hAnsi="Times New Roman" w:cs="Times New Roman"/>
+        </w:rPr>
+        <w:tab/>
+      </w:r>
+      <w:r>
+        <w:rPr>
+          <w:rFonts w:ascii="Times New Roman" w:hAnsi="Times New Roman" w:cs="Times New Roman"/>
+        </w:rPr>
+        <w:tab/>
+      </w:r>
+      <w:r>
+        <w:rPr>
+          <w:rFonts w:ascii="Times New Roman" w:hAnsi="Times New Roman" w:cs="Times New Roman"/>
+        </w:rPr>
+        <w:t>[1]</w:t>
       </w:r>
     </w:p>
     <w:p>
@@ -2667,16 +3078,16 @@
         <mc:AlternateContent>
           <mc:Choice Requires="wps">
             <w:drawing>
-              <wp:anchor distT="0" distB="0" distL="114300" distR="114300" simplePos="0" relativeHeight="251741184" behindDoc="0" locked="0" layoutInCell="1" allowOverlap="1" wp14:anchorId="44771004" wp14:editId="26AE4ED5">
+              <wp:anchor distT="0" distB="0" distL="114300" distR="114300" simplePos="0" relativeHeight="251741184" behindDoc="0" locked="0" layoutInCell="1" allowOverlap="1" wp14:anchorId="44771004" wp14:editId="1D525716">
                 <wp:simplePos x="0" y="0"/>
                 <wp:positionH relativeFrom="column">
-                  <wp:posOffset>1097280</wp:posOffset>
+                  <wp:posOffset>1093554</wp:posOffset>
                 </wp:positionH>
                 <wp:positionV relativeFrom="paragraph">
-                  <wp:posOffset>28575</wp:posOffset>
+                  <wp:posOffset>31546</wp:posOffset>
                 </wp:positionV>
-                <wp:extent cx="1097280" cy="762000"/>
-                <wp:effectExtent l="57150" t="19050" r="83820" b="95250"/>
+                <wp:extent cx="917563" cy="762000"/>
+                <wp:effectExtent l="0" t="0" r="16510" b="19050"/>
                 <wp:wrapNone/>
                 <wp:docPr id="27" name="Rectangle 27"/>
                 <wp:cNvGraphicFramePr/>
@@ -2687,7 +3098,7 @@
                       <wps:spPr>
                         <a:xfrm>
                           <a:off x="0" y="0"/>
-                          <a:ext cx="1097280" cy="762000"/>
+                          <a:ext cx="917563" cy="762000"/>
                         </a:xfrm>
                         <a:prstGeom prst="rect">
                           <a:avLst/>
@@ -2698,6 +3109,7 @@
                             <a:schemeClr val="tx1"/>
                           </a:solidFill>
                         </a:ln>
+                        <a:effectLst/>
                       </wps:spPr>
                       <wps:style>
                         <a:lnRef idx="1">
@@ -2722,6 +3134,9 @@
                     </wps:wsp>
                   </a:graphicData>
                 </a:graphic>
+                <wp14:sizeRelH relativeFrom="margin">
+                  <wp14:pctWidth>0</wp14:pctWidth>
+                </wp14:sizeRelH>
                 <wp14:sizeRelV relativeFrom="margin">
                   <wp14:pctHeight>0</wp14:pctHeight>
                 </wp14:sizeRelV>
@@ -2730,9 +3145,7 @@
           </mc:Choice>
           <mc:Fallback>
             <w:pict>
-              <v:rect w14:anchorId="63FEFD29" id="Rectangle 27" o:spid="_x0000_s1026" style="position:absolute;margin-left:86.4pt;margin-top:2.25pt;width:86.4pt;height:60pt;z-index:251741184;visibility:visible;mso-wrap-style:square;mso-height-percent:0;mso-wrap-distance-left:9pt;mso-wrap-distance-top:0;mso-wrap-distance-right:9pt;mso-wrap-distance-bottom:0;mso-position-horizontal:absolute;mso-position-horizontal-relative:text;mso-position-vertical:absolute;mso-position-vertical-relative:text;mso-height-percent:0;mso-height-relative:margin;v-text-anchor:middle" o:gfxdata="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" filled="f" strokecolor="black [3213]" strokeweight="1.5pt">
-                <v:shadow on="t" color="black" opacity="22937f" origin=",.5" offset="0,.63889mm"/>
-              </v:rect>
+              <v:rect w14:anchorId="2CDBC6D4" id="Rectangle 27" o:spid="_x0000_s1026" style="position:absolute;margin-left:86.1pt;margin-top:2.5pt;width:72.25pt;height:60pt;z-index:251741184;visibility:visible;mso-wrap-style:square;mso-width-percent:0;mso-height-percent:0;mso-wrap-distance-left:9pt;mso-wrap-distance-top:0;mso-wrap-distance-right:9pt;mso-wrap-distance-bottom:0;mso-position-horizontal:absolute;mso-position-horizontal-relative:text;mso-position-vertical:absolute;mso-position-vertical-relative:text;mso-width-percent:0;mso-height-percent:0;mso-width-relative:margin;mso-height-relative:margin;v-text-anchor:middle" o:gfxdata="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" filled="f" strokecolor="black [3213]" strokeweight="1.5pt"/>
             </w:pict>
           </mc:Fallback>
         </mc:AlternateContent>
@@ -2820,7 +3233,7 @@
           </mc:Choice>
           <mc:Fallback>
             <w:pict>
-              <v:shape w14:anchorId="08131201" id="Text Box 28" o:spid="_x0000_s1047" type="#_x0000_t202" style="position:absolute;left:0;text-align:left;margin-left:117pt;margin-top:19.75pt;width:37.8pt;height:20.4pt;z-index:251743232;visibility:visible;mso-wrap-style:square;mso-width-percent:0;mso-height-percent:0;mso-wrap-distance-left:9pt;mso-wrap-distance-top:0;mso-wrap-distance-right:9pt;mso-wrap-distance-bottom:0;mso-position-horizontal:absolute;mso-position-horizontal-relative:text;mso-position-vertical:absolute;mso-position-vertical-relative:text;mso-width-percent:0;mso-height-percent:0;mso-width-relative:margin;mso-height-relative:margin;v-text-anchor:top" o:gfxdata="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" filled="f" stroked="f" strokeweight=".5pt">
+              <v:shape w14:anchorId="08131201" id="Text Box 28" o:spid="_x0000_s1051" type="#_x0000_t202" style="position:absolute;left:0;text-align:left;margin-left:117pt;margin-top:19.75pt;width:37.8pt;height:20.4pt;z-index:251743232;visibility:visible;mso-wrap-style:square;mso-width-percent:0;mso-height-percent:0;mso-wrap-distance-left:9pt;mso-wrap-distance-top:0;mso-wrap-distance-right:9pt;mso-wrap-distance-bottom:0;mso-position-horizontal:absolute;mso-position-horizontal-relative:text;mso-position-vertical:absolute;mso-position-vertical-relative:text;mso-width-percent:0;mso-height-percent:0;mso-width-relative:margin;mso-height-relative:margin;v-text-anchor:top" o:gfxdata="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" filled="f" stroked="f" strokeweight=".5pt">
                 <v:textbox>
                   <w:txbxContent>
                     <w:p>
@@ -2952,16 +3365,16 @@
         <mc:AlternateContent>
           <mc:Choice Requires="wps">
             <w:drawing>
-              <wp:anchor distT="0" distB="0" distL="114300" distR="114300" simplePos="0" relativeHeight="251744256" behindDoc="0" locked="0" layoutInCell="1" allowOverlap="1" wp14:anchorId="32E0634B" wp14:editId="29B29A6E">
+              <wp:anchor distT="0" distB="0" distL="114300" distR="114300" simplePos="0" relativeHeight="251744256" behindDoc="0" locked="0" layoutInCell="1" allowOverlap="1" wp14:anchorId="32E0634B" wp14:editId="5132326C">
                 <wp:simplePos x="0" y="0"/>
                 <wp:positionH relativeFrom="column">
-                  <wp:posOffset>990600</wp:posOffset>
+                  <wp:posOffset>990036</wp:posOffset>
                 </wp:positionH>
                 <wp:positionV relativeFrom="paragraph">
-                  <wp:posOffset>218440</wp:posOffset>
+                  <wp:posOffset>214762</wp:posOffset>
                 </wp:positionV>
-                <wp:extent cx="1021080" cy="914400"/>
-                <wp:effectExtent l="57150" t="19050" r="83820" b="95250"/>
+                <wp:extent cx="1984075" cy="914400"/>
+                <wp:effectExtent l="0" t="0" r="16510" b="19050"/>
                 <wp:wrapNone/>
                 <wp:docPr id="29" name="Rectangle 29"/>
                 <wp:cNvGraphicFramePr/>
@@ -2972,7 +3385,7 @@
                       <wps:spPr>
                         <a:xfrm>
                           <a:off x="0" y="0"/>
-                          <a:ext cx="1021080" cy="914400"/>
+                          <a:ext cx="1984075" cy="914400"/>
                         </a:xfrm>
                         <a:prstGeom prst="rect">
                           <a:avLst/>
@@ -2983,6 +3396,7 @@
                             <a:schemeClr val="tx1"/>
                           </a:solidFill>
                         </a:ln>
+                        <a:effectLst/>
                       </wps:spPr>
                       <wps:style>
                         <a:lnRef idx="1">
@@ -3018,9 +3432,7 @@
           </mc:Choice>
           <mc:Fallback>
             <w:pict>
-              <v:rect w14:anchorId="11C941AC" id="Rectangle 29" o:spid="_x0000_s1026" style="position:absolute;margin-left:78pt;margin-top:17.2pt;width:80.4pt;height:1in;z-index:251744256;visibility:visible;mso-wrap-style:square;mso-width-percent:0;mso-height-percent:0;mso-wrap-distance-left:9pt;mso-wrap-distance-top:0;mso-wrap-distance-right:9pt;mso-wrap-distance-bottom:0;mso-position-horizontal:absolute;mso-position-horizontal-relative:text;mso-position-vertical:absolute;mso-position-vertical-relative:text;mso-width-percent:0;mso-height-percent:0;mso-width-relative:margin;mso-height-relative:margin;v-text-anchor:middle" o:gfxdata="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" filled="f" strokecolor="black [3213]" strokeweight="1.5pt">
-                <v:shadow on="t" color="black" opacity="22937f" origin=",.5" offset="0,.63889mm"/>
-              </v:rect>
+              <v:rect w14:anchorId="1CFCA88B" id="Rectangle 29" o:spid="_x0000_s1026" style="position:absolute;margin-left:77.95pt;margin-top:16.9pt;width:156.25pt;height:1in;z-index:251744256;visibility:visible;mso-wrap-style:square;mso-width-percent:0;mso-height-percent:0;mso-wrap-distance-left:9pt;mso-wrap-distance-top:0;mso-wrap-distance-right:9pt;mso-wrap-distance-bottom:0;mso-position-horizontal:absolute;mso-position-horizontal-relative:text;mso-position-vertical:absolute;mso-position-vertical-relative:text;mso-width-percent:0;mso-height-percent:0;mso-width-relative:margin;mso-height-relative:margin;v-text-anchor:middle" o:gfxdata="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" filled="f" strokecolor="black [3213]" strokeweight="1.5pt"/>
             </w:pict>
           </mc:Fallback>
         </mc:AlternateContent>
@@ -3041,14 +3453,6 @@
           <w:rFonts w:ascii="Times New Roman" w:hAnsi="Times New Roman" w:cs="Times New Roman"/>
         </w:rPr>
       </w:pPr>
-    </w:p>
-    <w:p>
-      <w:pPr>
-        <w:ind w:left="720"/>
-        <w:rPr>
-          <w:rFonts w:ascii="Times New Roman" w:hAnsi="Times New Roman" w:cs="Times New Roman"/>
-        </w:rPr>
-      </w:pPr>
       <w:r>
         <w:rPr>
           <w:rFonts w:ascii="Times New Roman" w:hAnsi="Times New Roman" w:cs="Times New Roman"/>
@@ -3057,13 +3461,13 @@
         <mc:AlternateContent>
           <mc:Choice Requires="wps">
             <w:drawing>
-              <wp:anchor distT="0" distB="0" distL="114300" distR="114300" simplePos="0" relativeHeight="251747328" behindDoc="0" locked="0" layoutInCell="1" allowOverlap="1" wp14:anchorId="7B999507" wp14:editId="4DF7225B">
+              <wp:anchor distT="0" distB="0" distL="114300" distR="114300" simplePos="0" relativeHeight="251747328" behindDoc="0" locked="0" layoutInCell="1" allowOverlap="1" wp14:anchorId="7B999507" wp14:editId="79A59E1C">
                 <wp:simplePos x="0" y="0"/>
                 <wp:positionH relativeFrom="column">
-                  <wp:posOffset>2049780</wp:posOffset>
+                  <wp:posOffset>3067301</wp:posOffset>
                 </wp:positionH>
                 <wp:positionV relativeFrom="paragraph">
-                  <wp:posOffset>76835</wp:posOffset>
+                  <wp:posOffset>207153</wp:posOffset>
                 </wp:positionV>
                 <wp:extent cx="510540" cy="236220"/>
                 <wp:effectExtent l="0" t="0" r="3810" b="0"/>
@@ -3121,7 +3525,7 @@
           </mc:Choice>
           <mc:Fallback>
             <w:pict>
-              <v:shape w14:anchorId="7B999507" id="Text Box 31" o:spid="_x0000_s1048" type="#_x0000_t202" style="position:absolute;left:0;text-align:left;margin-left:161.4pt;margin-top:6.05pt;width:40.2pt;height:18.6pt;z-index:251747328;visibility:visible;mso-wrap-style:square;mso-width-percent:0;mso-height-percent:0;mso-wrap-distance-left:9pt;mso-wrap-distance-top:0;mso-wrap-distance-right:9pt;mso-wrap-distance-bottom:0;mso-position-horizontal:absolute;mso-position-horizontal-relative:text;mso-position-vertical:absolute;mso-position-vertical-relative:text;mso-width-percent:0;mso-height-percent:0;mso-width-relative:margin;mso-height-relative:margin;v-text-anchor:top" o:gfxdata="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" fillcolor="window" stroked="f" strokeweight=".5pt">
+              <v:shape w14:anchorId="7B999507" id="Text Box 31" o:spid="_x0000_s1052" type="#_x0000_t202" style="position:absolute;left:0;text-align:left;margin-left:241.5pt;margin-top:16.3pt;width:40.2pt;height:18.6pt;z-index:251747328;visibility:visible;mso-wrap-style:square;mso-width-percent:0;mso-height-percent:0;mso-wrap-distance-left:9pt;mso-wrap-distance-top:0;mso-wrap-distance-right:9pt;mso-wrap-distance-bottom:0;mso-position-horizontal:absolute;mso-position-horizontal-relative:text;mso-position-vertical:absolute;mso-position-vertical-relative:text;mso-width-percent:0;mso-height-percent:0;mso-width-relative:margin;mso-height-relative:margin;v-text-anchor:top" o:gfxdata="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" fillcolor="window" stroked="f" strokeweight=".5pt">
                 <v:textbox>
                   <w:txbxContent>
                     <w:p>
@@ -3139,6 +3543,14 @@
           </mc:Fallback>
         </mc:AlternateContent>
       </w:r>
+    </w:p>
+    <w:p>
+      <w:pPr>
+        <w:ind w:left="720"/>
+        <w:rPr>
+          <w:rFonts w:ascii="Times New Roman" w:hAnsi="Times New Roman" w:cs="Times New Roman"/>
+        </w:rPr>
+      </w:pPr>
     </w:p>
     <w:p>
       <w:pPr>
@@ -3216,7 +3628,7 @@
           </mc:Choice>
           <mc:Fallback>
             <w:pict>
-              <v:shape w14:anchorId="1CEDDDCB" id="Text Box 30" o:spid="_x0000_s1049" type="#_x0000_t202" style="position:absolute;left:0;text-align:left;margin-left:104.85pt;margin-top:21.05pt;width:40.2pt;height:18.6pt;z-index:251746304;visibility:visible;mso-wrap-style:square;mso-width-percent:0;mso-height-percent:0;mso-wrap-distance-left:9pt;mso-wrap-distance-top:0;mso-wrap-distance-right:9pt;mso-wrap-distance-bottom:0;mso-position-horizontal:absolute;mso-position-horizontal-relative:text;mso-position-vertical:absolute;mso-position-vertical-relative:text;mso-width-percent:0;mso-height-percent:0;mso-width-relative:margin;mso-height-relative:margin;v-text-anchor:top" o:gfxdata="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" fillcolor="white [3201]" stroked="f" strokeweight=".5pt">
+              <v:shape w14:anchorId="1CEDDDCB" id="Text Box 30" o:spid="_x0000_s1053" type="#_x0000_t202" style="position:absolute;left:0;text-align:left;margin-left:104.85pt;margin-top:21.05pt;width:40.2pt;height:18.6pt;z-index:251746304;visibility:visible;mso-wrap-style:square;mso-width-percent:0;mso-height-percent:0;mso-wrap-distance-left:9pt;mso-wrap-distance-top:0;mso-wrap-distance-right:9pt;mso-wrap-distance-bottom:0;mso-position-horizontal:absolute;mso-position-horizontal-relative:text;mso-position-vertical:absolute;mso-position-vertical-relative:text;mso-width-percent:0;mso-height-percent:0;mso-width-relative:margin;mso-height-relative:margin;v-text-anchor:top" o:gfxdata="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" fillcolor="white [3201]" stroked="f" strokeweight=".5pt">
                 <v:textbox>
                   <w:txbxContent>
                     <w:p>
@@ -3338,17 +3750,20 @@
         <w:ind w:left="720"/>
         <w:rPr>
           <w:rFonts w:ascii="Times New Roman" w:hAnsi="Times New Roman" w:cs="Times New Roman"/>
+          <w:noProof/>
         </w:rPr>
       </w:pPr>
       <w:r>
         <w:rPr>
           <w:rFonts w:ascii="Times New Roman" w:hAnsi="Times New Roman" w:cs="Times New Roman"/>
+          <w:b/>
+          <w:bCs/>
           <w:noProof/>
         </w:rPr>
         <mc:AlternateContent>
           <mc:Choice Requires="wps">
             <w:drawing>
-              <wp:anchor distT="0" distB="0" distL="114300" distR="114300" simplePos="0" relativeHeight="251752448" behindDoc="0" locked="0" layoutInCell="1" allowOverlap="1" wp14:anchorId="19222367" wp14:editId="30CE1A29">
+              <wp:anchor distT="0" distB="0" distL="114300" distR="114300" simplePos="0" relativeHeight="251752448" behindDoc="0" locked="0" layoutInCell="1" allowOverlap="1" wp14:anchorId="19222367" wp14:editId="36B915A9">
                 <wp:simplePos x="0" y="0"/>
                 <wp:positionH relativeFrom="column">
                   <wp:posOffset>-152400</wp:posOffset>
@@ -3357,7 +3772,7 @@
                   <wp:posOffset>320675</wp:posOffset>
                 </wp:positionV>
                 <wp:extent cx="5095875" cy="3878580"/>
-                <wp:effectExtent l="57150" t="19050" r="85725" b="102870"/>
+                <wp:effectExtent l="0" t="0" r="28575" b="26670"/>
                 <wp:wrapNone/>
                 <wp:docPr id="32" name="Rectangle 32"/>
                 <wp:cNvGraphicFramePr/>
@@ -3379,6 +3794,7 @@
                             <a:schemeClr val="tx1"/>
                           </a:solidFill>
                         </a:ln>
+                        <a:effectLst/>
                       </wps:spPr>
                       <wps:style>
                         <a:lnRef idx="1">
@@ -3414,9 +3830,7 @@
           </mc:Choice>
           <mc:Fallback>
             <w:pict>
-              <v:rect w14:anchorId="0F5EDC40" id="Rectangle 32" o:spid="_x0000_s1026" style="position:absolute;margin-left:-12pt;margin-top:25.25pt;width:401.25pt;height:305.4pt;z-index:251752448;visibility:visible;mso-wrap-style:square;mso-width-percent:0;mso-height-percent:0;mso-wrap-distance-left:9pt;mso-wrap-distance-top:0;mso-wrap-distance-right:9pt;mso-wrap-distance-bottom:0;mso-position-horizontal:absolute;mso-position-horizontal-relative:text;mso-position-vertical:absolute;mso-position-vertical-relative:text;mso-width-percent:0;mso-height-percent:0;mso-width-relative:margin;mso-height-relative:margin;v-text-anchor:middle" o:gfxdata="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" filled="f" strokecolor="black [3213]" strokeweight="1.5pt">
-                <v:shadow on="t" color="black" opacity="22937f" origin=",.5" offset="0,.63889mm"/>
-              </v:rect>
+              <v:rect w14:anchorId="64436908" id="Rectangle 32" o:spid="_x0000_s1026" style="position:absolute;margin-left:-12pt;margin-top:25.25pt;width:401.25pt;height:305.4pt;z-index:251752448;visibility:visible;mso-wrap-style:square;mso-width-percent:0;mso-height-percent:0;mso-wrap-distance-left:9pt;mso-wrap-distance-top:0;mso-wrap-distance-right:9pt;mso-wrap-distance-bottom:0;mso-position-horizontal:absolute;mso-position-horizontal-relative:text;mso-position-vertical:absolute;mso-position-vertical-relative:text;mso-width-percent:0;mso-height-percent:0;mso-width-relative:margin;mso-height-relative:margin;v-text-anchor:middle" o:gfxdata="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" filled="f" strokecolor="black [3213]" strokeweight="1.5pt"/>
             </w:pict>
           </mc:Fallback>
         </mc:AlternateContent>
@@ -3424,8 +3838,50 @@
       <w:r>
         <w:rPr>
           <w:rFonts w:ascii="Times New Roman" w:hAnsi="Times New Roman" w:cs="Times New Roman"/>
-        </w:rPr>
-        <w:t xml:space="preserve">10. </w:t>
+          <w:b/>
+          <w:bCs/>
+        </w:rPr>
+        <w:t>10.</w:t>
+      </w:r>
+      <w:r>
+        <w:rPr>
+          <w:rFonts w:ascii="Times New Roman" w:hAnsi="Times New Roman" w:cs="Times New Roman"/>
+          <w:b/>
+          <w:bCs/>
+        </w:rPr>
+        <w:t xml:space="preserve"> </w:t>
+      </w:r>
+      <w:r>
+        <w:rPr>
+          <w:rFonts w:ascii="Times New Roman" w:hAnsi="Times New Roman" w:cs="Times New Roman"/>
+          <w:b/>
+          <w:bCs/>
+        </w:rPr>
+        <w:t xml:space="preserve">Look at the </w:t>
+      </w:r>
+      <w:r>
+        <w:rPr>
+          <w:rFonts w:ascii="Times New Roman" w:hAnsi="Times New Roman" w:cs="Times New Roman"/>
+          <w:b/>
+          <w:bCs/>
+        </w:rPr>
+        <w:t>bill</w:t>
+      </w:r>
+      <w:r>
+        <w:rPr>
+          <w:rFonts w:ascii="Times New Roman" w:hAnsi="Times New Roman" w:cs="Times New Roman"/>
+          <w:b/>
+          <w:bCs/>
+        </w:rPr>
+        <w:t xml:space="preserve"> and answer the following questions</w:t>
+      </w:r>
+      <w:r>
+        <w:rPr>
+          <w:rFonts w:ascii="Times New Roman" w:hAnsi="Times New Roman" w:cs="Times New Roman"/>
+          <w:b/>
+          <w:bCs/>
+        </w:rPr>
+        <w:t>.</w:t>
       </w:r>
     </w:p>
     <w:p>
@@ -3481,19 +3937,11 @@
                             <w:pPr>
                               <w:ind w:left="720"/>
                             </w:pPr>
-                            <w:proofErr w:type="spellStart"/>
                             <w:r>
                               <w:rPr>
                                 <w:rFonts w:ascii="Times New Roman" w:hAnsi="Times New Roman" w:cs="Times New Roman"/>
                               </w:rPr>
-                              <w:t>Readmore</w:t>
-                            </w:r>
-                            <w:proofErr w:type="spellEnd"/>
-                            <w:r>
-                              <w:rPr>
-                                <w:rFonts w:ascii="Times New Roman" w:hAnsi="Times New Roman" w:cs="Times New Roman"/>
-                              </w:rPr>
-                              <w:t xml:space="preserve"> Books Distributors</w:t>
+                              <w:t>Readmore Books Distributors</w:t>
                             </w:r>
                             <w:r>
                               <w:rPr>
@@ -3536,26 +3984,18 @@
           </mc:Choice>
           <mc:Fallback>
             <w:pict>
-              <v:shape w14:anchorId="3187904A" id="Text Box 33" o:spid="_x0000_s1050" type="#_x0000_t202" style="position:absolute;left:0;text-align:left;margin-left:84.15pt;margin-top:9.1pt;width:195.6pt;height:37.2pt;z-index:251757568;visibility:visible;mso-wrap-style:square;mso-width-percent:0;mso-height-percent:0;mso-wrap-distance-left:9pt;mso-wrap-distance-top:0;mso-wrap-distance-right:9pt;mso-wrap-distance-bottom:0;mso-position-horizontal:absolute;mso-position-horizontal-relative:text;mso-position-vertical:absolute;mso-position-vertical-relative:text;mso-width-percent:0;mso-height-percent:0;mso-width-relative:margin;mso-height-relative:margin;v-text-anchor:top" o:gfxdata="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" fillcolor="white [3201]" stroked="f" strokeweight=".5pt">
+              <v:shape w14:anchorId="3187904A" id="Text Box 33" o:spid="_x0000_s1054" type="#_x0000_t202" style="position:absolute;left:0;text-align:left;margin-left:84.15pt;margin-top:9.1pt;width:195.6pt;height:37.2pt;z-index:251757568;visibility:visible;mso-wrap-style:square;mso-width-percent:0;mso-height-percent:0;mso-wrap-distance-left:9pt;mso-wrap-distance-top:0;mso-wrap-distance-right:9pt;mso-wrap-distance-bottom:0;mso-position-horizontal:absolute;mso-position-horizontal-relative:text;mso-position-vertical:absolute;mso-position-vertical-relative:text;mso-width-percent:0;mso-height-percent:0;mso-width-relative:margin;mso-height-relative:margin;v-text-anchor:top" o:gfxdata="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" fillcolor="white [3201]" stroked="f" strokeweight=".5pt">
                 <v:textbox>
                   <w:txbxContent>
                     <w:p>
                       <w:pPr>
                         <w:ind w:left="720"/>
                       </w:pPr>
-                      <w:proofErr w:type="spellStart"/>
                       <w:r>
                         <w:rPr>
                           <w:rFonts w:ascii="Times New Roman" w:hAnsi="Times New Roman" w:cs="Times New Roman"/>
                         </w:rPr>
-                        <w:t>Readmore</w:t>
-                      </w:r>
-                      <w:proofErr w:type="spellEnd"/>
-                      <w:r>
-                        <w:rPr>
-                          <w:rFonts w:ascii="Times New Roman" w:hAnsi="Times New Roman" w:cs="Times New Roman"/>
-                        </w:rPr>
-                        <w:t xml:space="preserve"> Books Distributors</w:t>
+                        <w:t>Readmore Books Distributors</w:t>
                       </w:r>
                       <w:r>
                         <w:rPr>
@@ -3685,7 +4125,7 @@
           </mc:Choice>
           <mc:Fallback>
             <w:pict>
-              <v:shape w14:anchorId="66AFD361" id="Text Box 34" o:spid="_x0000_s1051" type="#_x0000_t202" style="position:absolute;left:0;text-align:left;margin-left:-5.85pt;margin-top:6.95pt;width:150pt;height:38.4pt;z-index:251759616;visibility:visible;mso-wrap-style:square;mso-width-percent:0;mso-height-percent:0;mso-wrap-distance-left:9pt;mso-wrap-distance-top:0;mso-wrap-distance-right:9pt;mso-wrap-distance-bottom:0;mso-position-horizontal:absolute;mso-position-horizontal-relative:text;mso-position-vertical:absolute;mso-position-vertical-relative:text;mso-width-percent:0;mso-height-percent:0;mso-width-relative:margin;mso-height-relative:margin;v-text-anchor:top" o:gfxdata="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" fillcolor="white [3201]" stroked="f" strokeweight=".5pt">
+              <v:shape w14:anchorId="66AFD361" id="Text Box 34" o:spid="_x0000_s1055" type="#_x0000_t202" style="position:absolute;left:0;text-align:left;margin-left:-5.85pt;margin-top:6.95pt;width:150pt;height:38.4pt;z-index:251759616;visibility:visible;mso-wrap-style:square;mso-width-percent:0;mso-height-percent:0;mso-wrap-distance-left:9pt;mso-wrap-distance-top:0;mso-wrap-distance-right:9pt;mso-wrap-distance-bottom:0;mso-position-horizontal:absolute;mso-position-horizontal-relative:text;mso-position-vertical:absolute;mso-position-vertical-relative:text;mso-width-percent:0;mso-height-percent:0;mso-width-relative:margin;mso-height-relative:margin;v-text-anchor:top" o:gfxdata="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" fillcolor="white [3201]" stroked="f" strokeweight=".5pt">
                 <v:textbox>
                   <w:txbxContent>
                     <w:p>
@@ -3788,7 +4228,7 @@
           </mc:Choice>
           <mc:Fallback>
             <w:pict>
-              <v:shape w14:anchorId="57B18FD6" id="Text Box 39" o:spid="_x0000_s1052" type="#_x0000_t202" style="position:absolute;left:0;text-align:left;margin-left:296.55pt;margin-top:206.65pt;width:102.6pt;height:48pt;z-index:251768832;visibility:visible;mso-wrap-style:square;mso-height-percent:0;mso-wrap-distance-left:9pt;mso-wrap-distance-top:0;mso-wrap-distance-right:9pt;mso-wrap-distance-bottom:0;mso-position-horizontal:absolute;mso-position-horizontal-relative:text;mso-position-vertical:absolute;mso-position-vertical-relative:text;mso-height-percent:0;mso-height-relative:margin;v-text-anchor:top" o:gfxdata="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" fillcolor="white [3201]" stroked="f" strokeweight=".5pt">
+              <v:shape w14:anchorId="57B18FD6" id="Text Box 39" o:spid="_x0000_s1056" type="#_x0000_t202" style="position:absolute;left:0;text-align:left;margin-left:296.55pt;margin-top:206.65pt;width:102.6pt;height:48pt;z-index:251768832;visibility:visible;mso-wrap-style:square;mso-height-percent:0;mso-wrap-distance-left:9pt;mso-wrap-distance-top:0;mso-wrap-distance-right:9pt;mso-wrap-distance-bottom:0;mso-position-horizontal:absolute;mso-position-horizontal-relative:text;mso-position-vertical:absolute;mso-position-vertical-relative:text;mso-height-percent:0;mso-height-relative:margin;v-text-anchor:top" o:gfxdata="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" fillcolor="white [3201]" stroked="f" strokeweight=".5pt">
                 <v:textbox>
                   <w:txbxContent>
                     <w:p>
@@ -3979,7 +4419,7 @@
           </mc:Choice>
           <mc:Fallback>
             <w:pict>
-              <v:shape w14:anchorId="69E7431E" id="Text Box 35" o:spid="_x0000_s1053" type="#_x0000_t202" style="position:absolute;left:0;text-align:left;margin-left:294.75pt;margin-top:1.4pt;width:89.4pt;height:40.2pt;z-index:251763712;visibility:visible;mso-wrap-style:square;mso-width-percent:0;mso-height-percent:0;mso-wrap-distance-left:9pt;mso-wrap-distance-top:0;mso-wrap-distance-right:9pt;mso-wrap-distance-bottom:0;mso-position-horizontal:absolute;mso-position-horizontal-relative:text;mso-position-vertical:absolute;mso-position-vertical-relative:text;mso-width-percent:0;mso-height-percent:0;mso-width-relative:margin;mso-height-relative:margin;v-text-anchor:top" o:gfxdata="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" fillcolor="window" stroked="f" strokeweight=".5pt">
+              <v:shape w14:anchorId="69E7431E" id="Text Box 35" o:spid="_x0000_s1057" type="#_x0000_t202" style="position:absolute;left:0;text-align:left;margin-left:294.75pt;margin-top:1.4pt;width:89.4pt;height:40.2pt;z-index:251763712;visibility:visible;mso-wrap-style:square;mso-width-percent:0;mso-height-percent:0;mso-wrap-distance-left:9pt;mso-wrap-distance-top:0;mso-wrap-distance-right:9pt;mso-wrap-distance-bottom:0;mso-position-horizontal:absolute;mso-position-horizontal-relative:text;mso-position-vertical:absolute;mso-position-vertical-relative:text;mso-width-percent:0;mso-height-percent:0;mso-width-relative:margin;mso-height-relative:margin;v-text-anchor:top" o:gfxdata="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" fillcolor="window" stroked="f" strokeweight=".5pt">
                 <v:textbox>
                   <w:txbxContent>
                     <w:p>
@@ -4074,7 +4514,6 @@
                 <w:rFonts w:ascii="Times New Roman" w:hAnsi="Times New Roman" w:cs="Times New Roman"/>
               </w:rPr>
             </w:pPr>
-            <w:proofErr w:type="spellStart"/>
             <w:proofErr w:type="gramStart"/>
             <w:r>
               <w:rPr>
@@ -4082,7 +4521,6 @@
               </w:rPr>
               <w:t>S.n</w:t>
             </w:r>
-            <w:proofErr w:type="spellEnd"/>
             <w:proofErr w:type="gramEnd"/>
           </w:p>
         </w:tc>
@@ -4564,7 +5002,7 @@
           </mc:Choice>
           <mc:Fallback>
             <w:pict>
-              <v:shape w14:anchorId="56CFF131" id="Text Box 37" o:spid="_x0000_s1054" type="#_x0000_t202" style="position:absolute;left:0;text-align:left;margin-left:206.25pt;margin-top:123.25pt;width:157.8pt;height:18.75pt;z-index:251766784;visibility:visible;mso-wrap-style:square;mso-height-percent:0;mso-wrap-distance-left:9pt;mso-wrap-distance-top:0;mso-wrap-distance-right:9pt;mso-wrap-distance-bottom:0;mso-position-horizontal:absolute;mso-position-horizontal-relative:text;mso-position-vertical:absolute;mso-position-vertical-relative:text;mso-height-percent:0;mso-height-relative:margin;v-text-anchor:top" o:gfxdata="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" fillcolor="white [3201]" strokeweight=".5pt">
+              <v:shape w14:anchorId="56CFF131" id="Text Box 37" o:spid="_x0000_s1058" type="#_x0000_t202" style="position:absolute;left:0;text-align:left;margin-left:206.25pt;margin-top:123.25pt;width:157.8pt;height:18.75pt;z-index:251766784;visibility:visible;mso-wrap-style:square;mso-height-percent:0;mso-wrap-distance-left:9pt;mso-wrap-distance-top:0;mso-wrap-distance-right:9pt;mso-wrap-distance-bottom:0;mso-position-horizontal:absolute;mso-position-horizontal-relative:text;mso-position-vertical:absolute;mso-position-vertical-relative:text;mso-height-percent:0;mso-height-relative:margin;v-text-anchor:top" o:gfxdata="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" fillcolor="white [3201]" strokeweight=".5pt">
                 <v:textbox>
                   <w:txbxContent>
                     <w:p>
@@ -4669,7 +5107,7 @@
           </mc:Choice>
           <mc:Fallback>
             <w:pict>
-              <v:shape w14:anchorId="4877FE9C" id="Text Box 38" o:spid="_x0000_s1055" type="#_x0000_t202" style="position:absolute;left:0;text-align:left;margin-left:5.25pt;margin-top:18.55pt;width:200.25pt;height:27.6pt;z-index:251767808;visibility:visible;mso-wrap-style:square;mso-width-percent:0;mso-height-percent:0;mso-wrap-distance-left:9pt;mso-wrap-distance-top:0;mso-wrap-distance-right:9pt;mso-wrap-distance-bottom:0;mso-position-horizontal:absolute;mso-position-horizontal-relative:text;mso-position-vertical:absolute;mso-position-vertical-relative:text;mso-width-percent:0;mso-height-percent:0;mso-width-relative:margin;mso-height-relative:margin;v-text-anchor:top" o:gfxdata="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" fillcolor="white [3201]" stroked="f" strokeweight=".5pt">
+              <v:shape w14:anchorId="4877FE9C" id="Text Box 38" o:spid="_x0000_s1059" type="#_x0000_t202" style="position:absolute;left:0;text-align:left;margin-left:5.25pt;margin-top:18.55pt;width:200.25pt;height:27.6pt;z-index:251767808;visibility:visible;mso-wrap-style:square;mso-width-percent:0;mso-height-percent:0;mso-wrap-distance-left:9pt;mso-wrap-distance-top:0;mso-wrap-distance-right:9pt;mso-wrap-distance-bottom:0;mso-position-horizontal:absolute;mso-position-horizontal-relative:text;mso-position-vertical:absolute;mso-position-vertical-relative:text;mso-width-percent:0;mso-height-percent:0;mso-width-relative:margin;mso-height-relative:margin;v-text-anchor:top" o:gfxdata="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" fillcolor="white [3201]" stroked="f" strokeweight=".5pt">
                 <v:textbox>
                   <w:txbxContent>
                     <w:p>
@@ -4918,8 +5356,7 @@
     </w:p>
     <w:p>
       <w:pPr>
-        <w:spacing w:before="100" w:beforeAutospacing="1" w:after="100" w:afterAutospacing="1" w:line="240" w:lineRule="auto"/>
-        <w:ind w:left="360" w:hanging="360"/>
+        <w:spacing w:after="0" w:line="240" w:lineRule="auto"/>
         <w:rPr>
           <w:rFonts w:ascii="Times New Roman" w:eastAsia="Times New Roman" w:hAnsi="Times New Roman" w:cs="Times New Roman"/>
           <w:sz w:val="24"/>
@@ -4932,15 +5369,58 @@
           <w:sz w:val="24"/>
           <w:szCs w:val="24"/>
         </w:rPr>
-        <w:t>11.</w:t>
-      </w:r>
-      <w:r>
+        <w:t>(c) If customer gave Rs. 500, how much money she will get at return? [2]</w:t>
+      </w:r>
+    </w:p>
+    <w:p>
+      <w:pPr>
+        <w:spacing w:before="100" w:beforeAutospacing="1" w:after="100" w:afterAutospacing="1" w:line="240" w:lineRule="auto"/>
+        <w:ind w:left="360" w:hanging="360"/>
         <w:rPr>
           <w:rFonts w:ascii="Times New Roman" w:eastAsia="Times New Roman" w:hAnsi="Times New Roman" w:cs="Times New Roman"/>
           <w:sz w:val="24"/>
           <w:szCs w:val="24"/>
         </w:rPr>
+      </w:pPr>
+      <w:r>
+        <w:rPr>
+          <w:rFonts w:ascii="Times New Roman" w:eastAsia="Times New Roman" w:hAnsi="Times New Roman" w:cs="Times New Roman"/>
+          <w:b/>
+          <w:bCs/>
+          <w:sz w:val="24"/>
+          <w:szCs w:val="24"/>
+        </w:rPr>
+        <w:t>11.</w:t>
+      </w:r>
+      <w:r>
+        <w:rPr>
+          <w:rFonts w:ascii="Times New Roman" w:eastAsia="Times New Roman" w:hAnsi="Times New Roman" w:cs="Times New Roman"/>
+          <w:b/>
+          <w:bCs/>
+          <w:sz w:val="24"/>
+          <w:szCs w:val="24"/>
+        </w:rPr>
         <w:t xml:space="preserve"> </w:t>
+      </w:r>
+      <w:r>
+        <w:rPr>
+          <w:rFonts w:ascii="Times New Roman" w:eastAsia="Times New Roman" w:hAnsi="Times New Roman" w:cs="Times New Roman"/>
+          <w:b/>
+          <w:bCs/>
+          <w:sz w:val="24"/>
+          <w:szCs w:val="24"/>
+        </w:rPr>
+        <w:t>Humans have 32 teeth</w:t>
+      </w:r>
+      <w:r>
+        <w:rPr>
+          <w:rFonts w:ascii="Times New Roman" w:eastAsia="Times New Roman" w:hAnsi="Times New Roman" w:cs="Times New Roman"/>
+          <w:b/>
+          <w:bCs/>
+          <w:sz w:val="24"/>
+          <w:szCs w:val="24"/>
+        </w:rPr>
+        <w:t>s, Dolphins have 200 teeth, Dog have 42 teeths, cows have 32 teeths. Tabulate this information.</w:t>
       </w:r>
       <w:r>
         <w:rPr>
@@ -4948,127 +5428,25 @@
           <w:sz w:val="24"/>
           <w:szCs w:val="24"/>
         </w:rPr>
-        <w:t xml:space="preserve">Humans have 32 </w:t>
-      </w:r>
-      <w:proofErr w:type="spellStart"/>
+        <w:tab/>
+      </w:r>
+      <w:r>
+        <w:rPr>
+          <w:rFonts w:ascii="Times New Roman" w:eastAsia="Times New Roman" w:hAnsi="Times New Roman" w:cs="Times New Roman"/>
+          <w:b/>
+          <w:bCs/>
+          <w:sz w:val="24"/>
+          <w:szCs w:val="24"/>
+        </w:rPr>
+        <w:t>[3]</w:t>
+      </w:r>
       <w:r>
         <w:rPr>
           <w:rFonts w:ascii="Times New Roman" w:eastAsia="Times New Roman" w:hAnsi="Times New Roman" w:cs="Times New Roman"/>
           <w:sz w:val="24"/>
           <w:szCs w:val="24"/>
         </w:rPr>
-        <w:t>teeth</w:t>
-      </w:r>
-      <w:r>
-        <w:rPr>
-          <w:rFonts w:ascii="Times New Roman" w:eastAsia="Times New Roman" w:hAnsi="Times New Roman" w:cs="Times New Roman"/>
-          <w:sz w:val="24"/>
-          <w:szCs w:val="24"/>
-        </w:rPr>
-        <w:t>s</w:t>
-      </w:r>
-      <w:proofErr w:type="spellEnd"/>
-      <w:r>
-        <w:rPr>
-          <w:rFonts w:ascii="Times New Roman" w:eastAsia="Times New Roman" w:hAnsi="Times New Roman" w:cs="Times New Roman"/>
-          <w:sz w:val="24"/>
-          <w:szCs w:val="24"/>
-        </w:rPr>
-        <w:t xml:space="preserve">, Dolphins have 200 teeth, Dog have 42 </w:t>
-      </w:r>
-      <w:proofErr w:type="spellStart"/>
-      <w:proofErr w:type="gramStart"/>
-      <w:r>
-        <w:rPr>
-          <w:rFonts w:ascii="Times New Roman" w:eastAsia="Times New Roman" w:hAnsi="Times New Roman" w:cs="Times New Roman"/>
-          <w:sz w:val="24"/>
-          <w:szCs w:val="24"/>
-        </w:rPr>
-        <w:t>teeths</w:t>
-      </w:r>
-      <w:proofErr w:type="spellEnd"/>
-      <w:r>
-        <w:rPr>
-          <w:rFonts w:ascii="Times New Roman" w:eastAsia="Times New Roman" w:hAnsi="Times New Roman" w:cs="Times New Roman"/>
-          <w:sz w:val="24"/>
-          <w:szCs w:val="24"/>
-        </w:rPr>
-        <w:t xml:space="preserve">, </w:t>
-      </w:r>
-      <w:r>
-        <w:rPr>
-          <w:rFonts w:ascii="Times New Roman" w:eastAsia="Times New Roman" w:hAnsi="Times New Roman" w:cs="Times New Roman"/>
-          <w:sz w:val="24"/>
-          <w:szCs w:val="24"/>
-        </w:rPr>
-        <w:t xml:space="preserve"> </w:t>
-      </w:r>
-      <w:r>
-        <w:rPr>
-          <w:rFonts w:ascii="Times New Roman" w:eastAsia="Times New Roman" w:hAnsi="Times New Roman" w:cs="Times New Roman"/>
-          <w:sz w:val="24"/>
-          <w:szCs w:val="24"/>
-        </w:rPr>
-        <w:t>cows</w:t>
-      </w:r>
-      <w:proofErr w:type="gramEnd"/>
-      <w:r>
-        <w:rPr>
-          <w:rFonts w:ascii="Times New Roman" w:eastAsia="Times New Roman" w:hAnsi="Times New Roman" w:cs="Times New Roman"/>
-          <w:sz w:val="24"/>
-          <w:szCs w:val="24"/>
-        </w:rPr>
-        <w:t xml:space="preserve"> have 32 </w:t>
-      </w:r>
-      <w:proofErr w:type="spellStart"/>
-      <w:r>
-        <w:rPr>
-          <w:rFonts w:ascii="Times New Roman" w:eastAsia="Times New Roman" w:hAnsi="Times New Roman" w:cs="Times New Roman"/>
-          <w:sz w:val="24"/>
-          <w:szCs w:val="24"/>
-        </w:rPr>
-        <w:t>teeths</w:t>
-      </w:r>
-      <w:proofErr w:type="spellEnd"/>
-      <w:r>
-        <w:rPr>
-          <w:rFonts w:ascii="Times New Roman" w:eastAsia="Times New Roman" w:hAnsi="Times New Roman" w:cs="Times New Roman"/>
-          <w:sz w:val="24"/>
-          <w:szCs w:val="24"/>
-        </w:rPr>
-        <w:t>. Tabulate this information.</w:t>
-      </w:r>
-      <w:r>
-        <w:rPr>
-          <w:rFonts w:ascii="Times New Roman" w:eastAsia="Times New Roman" w:hAnsi="Times New Roman" w:cs="Times New Roman"/>
-          <w:sz w:val="24"/>
-          <w:szCs w:val="24"/>
-        </w:rPr>
-        <w:tab/>
-      </w:r>
-      <w:r>
-        <w:rPr>
-          <w:rFonts w:ascii="Times New Roman" w:eastAsia="Times New Roman" w:hAnsi="Times New Roman" w:cs="Times New Roman"/>
-          <w:sz w:val="24"/>
-          <w:szCs w:val="24"/>
-        </w:rPr>
-        <w:tab/>
-      </w:r>
-      <w:r>
-        <w:rPr>
-          <w:rFonts w:ascii="Times New Roman" w:eastAsia="Times New Roman" w:hAnsi="Times New Roman" w:cs="Times New Roman"/>
-          <w:sz w:val="24"/>
-          <w:szCs w:val="24"/>
-        </w:rPr>
-        <w:tab/>
-      </w:r>
-      <w:r>
-        <w:rPr>
-          <w:rFonts w:ascii="Times New Roman" w:eastAsia="Times New Roman" w:hAnsi="Times New Roman" w:cs="Times New Roman"/>
-          <w:sz w:val="24"/>
-          <w:szCs w:val="24"/>
-        </w:rPr>
-        <w:t>[3] </w:t>
+        <w:t> </w:t>
       </w:r>
     </w:p>
     <w:p>

</xml_diff>